<commit_message>
Humanize portfolio copy and attached Word documents
Removed all em/en dashes and tightened phrasing across the site
and both generated docx files to read more naturally.
</commit_message>
<xml_diff>
--- a/files/Interview Prep Coach - Artifact Writeup.docx
+++ b/files/Interview Prep Coach - Artifact Writeup.docx
@@ -61,7 +61,7 @@
         <w:t xml:space="preserve">AIML-500, Workshop 1</w:t>
       </w:r>
       <w:r>
-        <w:t xml:space="preserve"> (Group 2, eight members, Professor Lawrence Iweriebor). The assignment was to apply the design thinking process end-to-end — empathize, define, ideate, prototype, and test — to build a working AI chatbot. Our group chose to tackle a problem several of us were living through directly that same week: preparing for AI/ML and Data interviews with no structured, affordable way to practice.</w:t>
+        <w:t xml:space="preserve"> (Group 2, eight members, Professor Lawrence Iweriebor). The assignment was to apply the design thinking process end to end (empathize, define, ideate, prototype, and test) to build a working AI chatbot. Our group chose to tackle a problem several of us were living through directly that same week: preparing for AI/ML and Data interviews with no structured, affordable way to practice.</w:t>
       </w:r>
     </w:p>
     <w:p>
@@ -105,7 +105,7 @@
         <w:spacing w:after="100"/>
       </w:pPr>
       <w:r>
-        <w:t xml:space="preserve">Generates five role-specific interview questions (one warm-up, two technical, one behavioral, one curveball) based on the role, company type, and experience level the candidate provides — each with a one-line hint on what interviewers are actually listening for.</w:t>
+        <w:t xml:space="preserve">Generates five role-specific interview questions (one warm-up, two technical, one behavioral, one curveball) based on the role, company type, and experience level the candidate provides, each with a one-line hint on what interviewers are actually listening for.</w:t>
       </w:r>
     </w:p>
     <w:p>
@@ -118,7 +118,7 @@
         <w:spacing w:after="100"/>
       </w:pPr>
       <w:r>
-        <w:t xml:space="preserve">Evaluates a candidate's answer to any question in four parts: what worked, what's missing, what to add, and a stronger reference version — coaching the thinking behind the answer rather than a memorized script.</w:t>
+        <w:t xml:space="preserve">Evaluates a candidate's answer to any question in four parts: what worked, what's missing, what to add, and a stronger reference version. It coaches the thinking behind the answer rather than a memorized script.</w:t>
       </w:r>
     </w:p>
     <w:p>
@@ -147,7 +147,7 @@
         <w:spacing w:after="200"/>
       </w:pPr>
       <w:r>
-        <w:t xml:space="preserve">Every existing option for interview prep fell short in the same way: generic prep books aren't role-specific, forum threads are unstructured and unreliable, paid coaches cost $50–$200 per session, and solo practice gives no honest feedback. The gap we identified was that candidates need role-specific questions and honest feedback on their answers — both accessible instantly, and both free. Our objective was to close that gap with a working tool, not just a concept.</w:t>
+        <w:t xml:space="preserve">Every existing option for interview prep fell short in the same way: generic prep books aren't role-specific, forum threads are unstructured and unreliable, paid coaches cost $50 to $200 per session, and solo practice gives no honest feedback. The gap we identified was that candidates need role-specific questions and honest feedback on their answers, both accessible instantly and both free. Our objective was to close that gap with a working tool, not just a concept.</w:t>
       </w:r>
     </w:p>
     <w:p>
@@ -175,7 +175,7 @@
         <w:t xml:space="preserve">Empathize.</w:t>
       </w:r>
       <w:r>
-        <w:t xml:space="preserve"> Our first instinct was to scrape sites like Glassdoor and build a large database of real interview questions. Talking through the actual pain point showed that quantity of questions was never the problem — the missing piece was structure and feedback. That insight alone saved an estimated two weeks of unnecessary engineering.</w:t>
+        <w:t xml:space="preserve"> Our first instinct was to scrape sites like Glassdoor and build a large database of real interview questions. Talking through the actual pain point showed that quantity of questions was never the problem: the missing piece was structure and feedback. That insight alone saved an estimated two weeks of unnecessary engineering.</w:t>
       </w:r>
     </w:p>
     <w:p>
@@ -205,7 +205,7 @@
         <w:t xml:space="preserve">Prototype &amp; Test.</w:t>
       </w:r>
       <w:r>
-        <w:t xml:space="preserve"> We ran 15 test scenarios against the bot — from basic prep requests and off-topic questions to edge cases like salary negotiation advice, vague single-word input, illegal interview questions, contradictory user info, and roleplay requests. 14 of 15 passed; one (roleplay as interviewer) was a partial pass. Testing caught two real bugs: an early version gave scripted, memorizable answers, and a later version produced generic follow-up questions with no role-specific detail. Iterating the system prompt twice resolved both.</w:t>
+        <w:t xml:space="preserve"> We ran 15 test scenarios against the bot, from basic prep requests and off-topic questions to edge cases like salary negotiation advice, vague single-word input, illegal interview questions, contradictory user info, and roleplay requests. 14 of 15 passed; one (roleplay as interviewer) was a partial pass. Testing caught two real bugs: an early version gave scripted, memorizable answers, and a later version produced generic follow-up questions with no role-specific detail. Iterating the system prompt twice resolved both.</w:t>
       </w:r>
     </w:p>
     <w:p>
@@ -240,7 +240,7 @@
         </w:rPr>
         <w:t xml:space="preserve">Live bot: </w:t>
       </w:r>
-      <w:hyperlink w:history="1" r:id="rIduz1pziznxhqvwztbepm5-">
+      <w:hyperlink w:history="1" r:id="rIdebp1m3lym-2ilaahxjidz">
         <w:r>
           <w:rPr>
             <w:rStyle w:val="Hyperlink"/>
@@ -276,7 +276,7 @@
         <w:t xml:space="preserve">Unique Value: </w:t>
       </w:r>
       <w:r>
-        <w:t xml:space="preserve">This artifact shows I can work inside a cross-functional team to take an AI product from a raw pain point to a tested, working tool in a single workshop — without writing a line of traditional code. The empathize-stage pivot (structure and feedback, not more questions) is the kind of judgment call that separates a tool people actually use from one that just looks impressive.</w:t>
+        <w:t xml:space="preserve">This artifact shows I can work inside a cross-functional team to take an AI product from a raw pain point to a tested, working tool in a single workshop, without writing a line of traditional code. The empathize-stage pivot (structure and feedback, not more questions) is the kind of judgment call that separates a tool people actually use from one that just looks impressive.</w:t>
       </w:r>
     </w:p>
     <w:p>
@@ -291,7 +291,7 @@
         <w:t xml:space="preserve">Relevance: </w:t>
       </w:r>
       <w:r>
-        <w:t xml:space="preserve">For an employer evaluating whether I can operate in AI product development — not just financial systems — this shows structured testing discipline (15 documented scenarios), the ability to catch and fix real failure modes in an AI system's behavior, and comfort applying a human-centered design process to a technical build.</w:t>
+        <w:t xml:space="preserve">For an employer evaluating whether I can operate in AI product development, not just financial systems, this shows structured testing discipline (15 documented scenarios), the ability to catch and fix real failure modes in an AI system's behavior, and comfort applying a human-centered design process to a technical build.</w:t>
       </w:r>
     </w:p>
     <w:p>

</xml_diff>